<commit_message>
Updated docs 3rd june 26 and added Repo architecture
</commit_message>
<xml_diff>
--- a/d4_dart_extras_throw_exception_and_more.docx
+++ b/d4_dart_extras_throw_exception_and_more.docx
@@ -39821,6 +39821,1469 @@
         <w:rPr>
           <w:sz w:val="36"/>
           <w:szCs w:val="36"/>
+        </w:rPr>
+      </w:pPr>
+    </w:p>
+    <w:p>
+      <w:pPr>
+        <w:jc w:val="both"/>
+        <w:rPr>
+          <w:sz w:val="36"/>
+          <w:szCs w:val="36"/>
+        </w:rPr>
+      </w:pPr>
+    </w:p>
+    <w:p>
+      <w:pPr>
+        <w:jc w:val="both"/>
+        <w:rPr>
+          <w:b/>
+          <w:bCs/>
+          <w:sz w:val="36"/>
+          <w:szCs w:val="36"/>
+        </w:rPr>
+      </w:pPr>
+      <w:proofErr w:type="spellStart"/>
+      <w:r>
+        <w:rPr>
+          <w:b/>
+          <w:bCs/>
+          <w:sz w:val="36"/>
+          <w:szCs w:val="36"/>
+        </w:rPr>
+        <w:t>LinkedHashMap</w:t>
+      </w:r>
+      <w:proofErr w:type="spellEnd"/>
+      <w:r>
+        <w:rPr>
+          <w:b/>
+          <w:bCs/>
+          <w:sz w:val="36"/>
+          <w:szCs w:val="36"/>
+        </w:rPr>
+        <w:t xml:space="preserve"> in Dart:</w:t>
+      </w:r>
+    </w:p>
+    <w:p>
+      <w:pPr>
+        <w:jc w:val="both"/>
+        <w:rPr>
+          <w:sz w:val="36"/>
+          <w:szCs w:val="36"/>
+        </w:rPr>
+      </w:pPr>
+      <w:r>
+        <w:rPr>
+          <w:sz w:val="36"/>
+          <w:szCs w:val="36"/>
+        </w:rPr>
+        <w:t xml:space="preserve"># Unlike regular </w:t>
+      </w:r>
+      <w:r>
+        <w:rPr>
+          <w:b/>
+          <w:bCs/>
+          <w:sz w:val="36"/>
+          <w:szCs w:val="36"/>
+        </w:rPr>
+        <w:t>Map</w:t>
+      </w:r>
+      <w:r>
+        <w:rPr>
+          <w:sz w:val="36"/>
+          <w:szCs w:val="36"/>
+        </w:rPr>
+        <w:t xml:space="preserve"> in </w:t>
+      </w:r>
+      <w:r>
+        <w:rPr>
+          <w:b/>
+          <w:bCs/>
+          <w:sz w:val="36"/>
+          <w:szCs w:val="36"/>
+        </w:rPr>
+        <w:t>Dart</w:t>
+      </w:r>
+      <w:r>
+        <w:rPr>
+          <w:sz w:val="36"/>
+          <w:szCs w:val="36"/>
+        </w:rPr>
+        <w:t xml:space="preserve">, </w:t>
+      </w:r>
+      <w:proofErr w:type="spellStart"/>
+      <w:r>
+        <w:rPr>
+          <w:b/>
+          <w:bCs/>
+          <w:sz w:val="36"/>
+          <w:szCs w:val="36"/>
+        </w:rPr>
+        <w:t>LinkedHashMap</w:t>
+      </w:r>
+      <w:proofErr w:type="spellEnd"/>
+      <w:r>
+        <w:rPr>
+          <w:sz w:val="36"/>
+          <w:szCs w:val="36"/>
+        </w:rPr>
+        <w:t xml:space="preserve"> preserves the insertion order like who was added last. Useful for creating and limiting LRU (Least Recently Used) cache.</w:t>
+      </w:r>
+    </w:p>
+    <w:p>
+      <w:pPr>
+        <w:jc w:val="both"/>
+        <w:rPr>
+          <w:sz w:val="32"/>
+          <w:szCs w:val="32"/>
+        </w:rPr>
+      </w:pPr>
+      <w:r>
+        <w:rPr>
+          <w:sz w:val="36"/>
+          <w:szCs w:val="36"/>
+        </w:rPr>
+        <w:t># It solves problems like last visited screen or movie.</w:t>
+      </w:r>
+      <w:r>
+        <w:rPr>
+          <w:sz w:val="32"/>
+          <w:szCs w:val="32"/>
+        </w:rPr>
+        <w:t xml:space="preserve"> </w:t>
+      </w:r>
+      <w:r>
+        <w:rPr>
+          <w:sz w:val="32"/>
+          <w:szCs w:val="32"/>
+        </w:rPr>
+        <w:t>Suppose:</w:t>
+      </w:r>
+    </w:p>
+    <w:p>
+      <w:pPr>
+        <w:jc w:val="both"/>
+        <w:rPr>
+          <w:b/>
+          <w:bCs/>
+          <w:sz w:val="32"/>
+          <w:szCs w:val="32"/>
+        </w:rPr>
+      </w:pPr>
+      <w:r>
+        <w:rPr>
+          <w:b/>
+          <w:bCs/>
+          <w:sz w:val="32"/>
+          <w:szCs w:val="32"/>
+        </w:rPr>
+        <w:t>Visit 1</w:t>
+      </w:r>
+    </w:p>
+    <w:p>
+      <w:pPr>
+        <w:jc w:val="both"/>
+        <w:rPr>
+          <w:b/>
+          <w:bCs/>
+          <w:sz w:val="32"/>
+          <w:szCs w:val="32"/>
+        </w:rPr>
+      </w:pPr>
+      <w:r>
+        <w:rPr>
+          <w:b/>
+          <w:bCs/>
+          <w:sz w:val="32"/>
+          <w:szCs w:val="32"/>
+        </w:rPr>
+        <w:t>Visit 2</w:t>
+      </w:r>
+    </w:p>
+    <w:p>
+      <w:pPr>
+        <w:jc w:val="both"/>
+        <w:rPr>
+          <w:b/>
+          <w:bCs/>
+          <w:sz w:val="32"/>
+          <w:szCs w:val="32"/>
+        </w:rPr>
+      </w:pPr>
+      <w:r>
+        <w:rPr>
+          <w:b/>
+          <w:bCs/>
+          <w:sz w:val="32"/>
+          <w:szCs w:val="32"/>
+        </w:rPr>
+        <w:t>Visit 3</w:t>
+      </w:r>
+    </w:p>
+    <w:p>
+      <w:pPr>
+        <w:jc w:val="both"/>
+        <w:rPr>
+          <w:b/>
+          <w:bCs/>
+          <w:sz w:val="32"/>
+          <w:szCs w:val="32"/>
+        </w:rPr>
+      </w:pPr>
+      <w:r>
+        <w:rPr>
+          <w:b/>
+          <w:bCs/>
+          <w:sz w:val="32"/>
+          <w:szCs w:val="32"/>
+        </w:rPr>
+        <w:lastRenderedPageBreak/>
+        <w:t>Cache = [1,2,3]</w:t>
+      </w:r>
+    </w:p>
+    <w:p>
+      <w:pPr>
+        <w:jc w:val="both"/>
+        <w:rPr>
+          <w:sz w:val="32"/>
+          <w:szCs w:val="32"/>
+        </w:rPr>
+      </w:pPr>
+      <w:r>
+        <w:rPr>
+          <w:sz w:val="32"/>
+          <w:szCs w:val="32"/>
+        </w:rPr>
+        <w:t xml:space="preserve"># </w:t>
+      </w:r>
+      <w:r>
+        <w:rPr>
+          <w:sz w:val="32"/>
+          <w:szCs w:val="32"/>
+        </w:rPr>
+        <w:t>Then user revisits:</w:t>
+      </w:r>
+    </w:p>
+    <w:p>
+      <w:pPr>
+        <w:jc w:val="both"/>
+        <w:rPr>
+          <w:b/>
+          <w:bCs/>
+          <w:sz w:val="32"/>
+          <w:szCs w:val="32"/>
+        </w:rPr>
+      </w:pPr>
+      <w:r>
+        <w:rPr>
+          <w:b/>
+          <w:bCs/>
+          <w:sz w:val="32"/>
+          <w:szCs w:val="32"/>
+        </w:rPr>
+        <w:t>Movie 1</w:t>
+      </w:r>
+    </w:p>
+    <w:p>
+      <w:pPr>
+        <w:jc w:val="both"/>
+        <w:rPr>
+          <w:b/>
+          <w:bCs/>
+          <w:sz w:val="32"/>
+          <w:szCs w:val="32"/>
+        </w:rPr>
+      </w:pPr>
+      <w:r>
+        <w:rPr>
+          <w:b/>
+          <w:bCs/>
+          <w:sz w:val="32"/>
+          <w:szCs w:val="32"/>
+        </w:rPr>
+        <w:t>Movie 1 should become "recently used".</w:t>
+      </w:r>
+    </w:p>
+    <w:p>
+      <w:pPr>
+        <w:jc w:val="both"/>
+        <w:rPr>
+          <w:sz w:val="32"/>
+          <w:szCs w:val="32"/>
+        </w:rPr>
+      </w:pPr>
+      <w:r>
+        <w:rPr>
+          <w:sz w:val="32"/>
+          <w:szCs w:val="32"/>
+        </w:rPr>
+        <w:t xml:space="preserve"># </w:t>
+      </w:r>
+      <w:r>
+        <w:rPr>
+          <w:sz w:val="32"/>
+          <w:szCs w:val="32"/>
+        </w:rPr>
+        <w:t>Cache becomes:</w:t>
+      </w:r>
+    </w:p>
+    <w:p>
+      <w:pPr>
+        <w:jc w:val="both"/>
+        <w:rPr>
+          <w:b/>
+          <w:bCs/>
+          <w:sz w:val="32"/>
+          <w:szCs w:val="32"/>
+        </w:rPr>
+      </w:pPr>
+      <w:r>
+        <w:rPr>
+          <w:b/>
+          <w:bCs/>
+          <w:sz w:val="32"/>
+          <w:szCs w:val="32"/>
+        </w:rPr>
+        <w:t>[2,3,1]</w:t>
+      </w:r>
+    </w:p>
+    <w:p>
+      <w:pPr>
+        <w:jc w:val="both"/>
+        <w:rPr>
+          <w:sz w:val="32"/>
+          <w:szCs w:val="32"/>
+        </w:rPr>
+      </w:pPr>
+      <w:r>
+        <w:rPr>
+          <w:sz w:val="32"/>
+          <w:szCs w:val="32"/>
+        </w:rPr>
+        <w:t xml:space="preserve"># </w:t>
+      </w:r>
+      <w:r>
+        <w:rPr>
+          <w:sz w:val="32"/>
+          <w:szCs w:val="32"/>
+        </w:rPr>
+        <w:t>Now user opens Movie 4</w:t>
+      </w:r>
+      <w:r>
+        <w:rPr>
+          <w:sz w:val="32"/>
+          <w:szCs w:val="32"/>
+        </w:rPr>
+        <w:t xml:space="preserve">, </w:t>
+      </w:r>
+      <w:r>
+        <w:rPr>
+          <w:sz w:val="32"/>
+          <w:szCs w:val="32"/>
+        </w:rPr>
+        <w:t>Notice how Movie 1 survived because it was recently used</w:t>
+      </w:r>
+      <w:r>
+        <w:rPr>
+          <w:sz w:val="32"/>
+          <w:szCs w:val="32"/>
+        </w:rPr>
+        <w:t>:</w:t>
+      </w:r>
+    </w:p>
+    <w:p>
+      <w:pPr>
+        <w:jc w:val="both"/>
+        <w:rPr>
+          <w:b/>
+          <w:bCs/>
+          <w:sz w:val="32"/>
+          <w:szCs w:val="32"/>
+        </w:rPr>
+      </w:pPr>
+      <w:r>
+        <w:rPr>
+          <w:b/>
+          <w:bCs/>
+          <w:sz w:val="32"/>
+          <w:szCs w:val="32"/>
+        </w:rPr>
+        <w:t>Remove 2</w:t>
+      </w:r>
+    </w:p>
+    <w:p>
+      <w:pPr>
+        <w:jc w:val="both"/>
+        <w:rPr>
+          <w:b/>
+          <w:bCs/>
+          <w:sz w:val="32"/>
+          <w:szCs w:val="32"/>
+        </w:rPr>
+      </w:pPr>
+      <w:r>
+        <w:rPr>
+          <w:b/>
+          <w:bCs/>
+          <w:sz w:val="32"/>
+          <w:szCs w:val="32"/>
+        </w:rPr>
+        <w:t>Cache = [3,1,4]</w:t>
+      </w:r>
+    </w:p>
+    <w:p>
+      <w:pPr>
+        <w:jc w:val="both"/>
+        <w:rPr>
+          <w:sz w:val="32"/>
+          <w:szCs w:val="32"/>
+        </w:rPr>
+      </w:pPr>
+      <w:r>
+        <w:rPr>
+          <w:sz w:val="36"/>
+          <w:szCs w:val="36"/>
+        </w:rPr>
+        <w:t xml:space="preserve"> # </w:t>
+      </w:r>
+      <w:r>
+        <w:rPr>
+          <w:sz w:val="32"/>
+          <w:szCs w:val="32"/>
+        </w:rPr>
+        <w:t xml:space="preserve">This keeps the most recently accessed </w:t>
+      </w:r>
+      <w:r>
+        <w:rPr>
+          <w:sz w:val="32"/>
+          <w:szCs w:val="32"/>
+        </w:rPr>
+        <w:t>screens or movies</w:t>
+      </w:r>
+      <w:r>
+        <w:rPr>
+          <w:sz w:val="32"/>
+          <w:szCs w:val="32"/>
+        </w:rPr>
+        <w:t xml:space="preserve"> (ordered by recent)</w:t>
+      </w:r>
+      <w:r>
+        <w:rPr>
+          <w:sz w:val="32"/>
+          <w:szCs w:val="32"/>
+        </w:rPr>
+        <w:t>. Create it using OOP:</w:t>
+      </w:r>
+    </w:p>
+    <w:p>
+      <w:pPr>
+        <w:jc w:val="both"/>
+        <w:rPr>
+          <w:b/>
+          <w:bCs/>
+          <w:color w:val="D86DCB" w:themeColor="accent5" w:themeTint="99"/>
+          <w:sz w:val="32"/>
+          <w:szCs w:val="32"/>
+        </w:rPr>
+      </w:pPr>
+      <w:r>
+        <w:rPr>
+          <w:b/>
+          <w:bCs/>
+          <w:color w:val="D86DCB" w:themeColor="accent5" w:themeTint="99"/>
+          <w:sz w:val="32"/>
+          <w:szCs w:val="32"/>
+        </w:rPr>
+        <w:t>import '</w:t>
+      </w:r>
+      <w:proofErr w:type="spellStart"/>
+      <w:proofErr w:type="gramStart"/>
+      <w:r>
+        <w:rPr>
+          <w:b/>
+          <w:bCs/>
+          <w:color w:val="D86DCB" w:themeColor="accent5" w:themeTint="99"/>
+          <w:sz w:val="32"/>
+          <w:szCs w:val="32"/>
+        </w:rPr>
+        <w:t>dart:collection</w:t>
+      </w:r>
+      <w:proofErr w:type="spellEnd"/>
+      <w:proofErr w:type="gramEnd"/>
+      <w:r>
+        <w:rPr>
+          <w:b/>
+          <w:bCs/>
+          <w:color w:val="D86DCB" w:themeColor="accent5" w:themeTint="99"/>
+          <w:sz w:val="32"/>
+          <w:szCs w:val="32"/>
+        </w:rPr>
+        <w:t>';</w:t>
+      </w:r>
+    </w:p>
+    <w:p>
+      <w:pPr>
+        <w:jc w:val="both"/>
+        <w:rPr>
+          <w:b/>
+          <w:bCs/>
+          <w:color w:val="D86DCB" w:themeColor="accent5" w:themeTint="99"/>
+          <w:sz w:val="32"/>
+          <w:szCs w:val="32"/>
+        </w:rPr>
+      </w:pPr>
+      <w:r>
+        <w:rPr>
+          <w:b/>
+          <w:bCs/>
+          <w:color w:val="D86DCB" w:themeColor="accent5" w:themeTint="99"/>
+          <w:sz w:val="32"/>
+          <w:szCs w:val="32"/>
+        </w:rPr>
+        <w:t xml:space="preserve">final </w:t>
+      </w:r>
+      <w:proofErr w:type="spellStart"/>
+      <w:r>
+        <w:rPr>
+          <w:b/>
+          <w:bCs/>
+          <w:color w:val="D86DCB" w:themeColor="accent5" w:themeTint="99"/>
+          <w:sz w:val="32"/>
+          <w:szCs w:val="32"/>
+        </w:rPr>
+        <w:t>LinkedHashMap</w:t>
+      </w:r>
+      <w:proofErr w:type="spellEnd"/>
+      <w:r>
+        <w:rPr>
+          <w:b/>
+          <w:bCs/>
+          <w:color w:val="D86DCB" w:themeColor="accent5" w:themeTint="99"/>
+          <w:sz w:val="32"/>
+          <w:szCs w:val="32"/>
+        </w:rPr>
+        <w:t xml:space="preserve">&lt;int, </w:t>
+      </w:r>
+      <w:proofErr w:type="spellStart"/>
+      <w:r>
+        <w:rPr>
+          <w:b/>
+          <w:bCs/>
+          <w:color w:val="D86DCB" w:themeColor="accent5" w:themeTint="99"/>
+          <w:sz w:val="32"/>
+          <w:szCs w:val="32"/>
+        </w:rPr>
+        <w:t>MovieDetailsModel</w:t>
+      </w:r>
+      <w:proofErr w:type="spellEnd"/>
+      <w:r>
+        <w:rPr>
+          <w:b/>
+          <w:bCs/>
+          <w:color w:val="D86DCB" w:themeColor="accent5" w:themeTint="99"/>
+          <w:sz w:val="32"/>
+          <w:szCs w:val="32"/>
+        </w:rPr>
+        <w:t>&gt; _cache =</w:t>
+      </w:r>
+    </w:p>
+    <w:p>
+      <w:pPr>
+        <w:jc w:val="both"/>
+        <w:rPr>
+          <w:color w:val="D86DCB" w:themeColor="accent5" w:themeTint="99"/>
+          <w:sz w:val="32"/>
+          <w:szCs w:val="32"/>
+        </w:rPr>
+      </w:pPr>
+      <w:r>
+        <w:rPr>
+          <w:b/>
+          <w:bCs/>
+          <w:color w:val="D86DCB" w:themeColor="accent5" w:themeTint="99"/>
+          <w:sz w:val="32"/>
+          <w:szCs w:val="32"/>
+        </w:rPr>
+        <w:t xml:space="preserve">    </w:t>
+      </w:r>
+      <w:proofErr w:type="spellStart"/>
+      <w:proofErr w:type="gramStart"/>
+      <w:r>
+        <w:rPr>
+          <w:b/>
+          <w:bCs/>
+          <w:color w:val="D86DCB" w:themeColor="accent5" w:themeTint="99"/>
+          <w:sz w:val="32"/>
+          <w:szCs w:val="32"/>
+        </w:rPr>
+        <w:t>LinkedHashMap</w:t>
+      </w:r>
+      <w:proofErr w:type="spellEnd"/>
+      <w:r>
+        <w:rPr>
+          <w:b/>
+          <w:bCs/>
+          <w:color w:val="D86DCB" w:themeColor="accent5" w:themeTint="99"/>
+          <w:sz w:val="32"/>
+          <w:szCs w:val="32"/>
+        </w:rPr>
+        <w:t>(</w:t>
+      </w:r>
+      <w:proofErr w:type="gramEnd"/>
+      <w:r>
+        <w:rPr>
+          <w:b/>
+          <w:bCs/>
+          <w:color w:val="D86DCB" w:themeColor="accent5" w:themeTint="99"/>
+          <w:sz w:val="32"/>
+          <w:szCs w:val="32"/>
+        </w:rPr>
+        <w:t>);</w:t>
+      </w:r>
+    </w:p>
+    <w:p>
+      <w:pPr>
+        <w:jc w:val="both"/>
+        <w:rPr>
+          <w:sz w:val="32"/>
+          <w:szCs w:val="32"/>
+        </w:rPr>
+      </w:pPr>
+      <w:r>
+        <w:rPr>
+          <w:sz w:val="32"/>
+          <w:szCs w:val="32"/>
+        </w:rPr>
+        <w:t># Then get values from it if available (matches key which is unique ID):</w:t>
+      </w:r>
+    </w:p>
+    <w:p>
+      <w:pPr>
+        <w:jc w:val="both"/>
+        <w:rPr>
+          <w:b/>
+          <w:bCs/>
+          <w:color w:val="D86DCB" w:themeColor="accent5" w:themeTint="99"/>
+          <w:sz w:val="32"/>
+          <w:szCs w:val="32"/>
+        </w:rPr>
+      </w:pPr>
+      <w:proofErr w:type="spellStart"/>
+      <w:r>
+        <w:rPr>
+          <w:b/>
+          <w:bCs/>
+          <w:color w:val="D86DCB" w:themeColor="accent5" w:themeTint="99"/>
+          <w:sz w:val="32"/>
+          <w:szCs w:val="32"/>
+        </w:rPr>
+        <w:t>MovieDetailsModel</w:t>
+      </w:r>
+      <w:proofErr w:type="spellEnd"/>
+      <w:r>
+        <w:rPr>
+          <w:b/>
+          <w:bCs/>
+          <w:color w:val="D86DCB" w:themeColor="accent5" w:themeTint="99"/>
+          <w:sz w:val="32"/>
+          <w:szCs w:val="32"/>
+        </w:rPr>
+        <w:t xml:space="preserve">? </w:t>
+      </w:r>
+      <w:proofErr w:type="spellStart"/>
+      <w:proofErr w:type="gramStart"/>
+      <w:r>
+        <w:rPr>
+          <w:b/>
+          <w:bCs/>
+          <w:color w:val="D86DCB" w:themeColor="accent5" w:themeTint="99"/>
+          <w:sz w:val="32"/>
+          <w:szCs w:val="32"/>
+        </w:rPr>
+        <w:t>getMovieFromCache</w:t>
+      </w:r>
+      <w:proofErr w:type="spellEnd"/>
+      <w:r>
+        <w:rPr>
+          <w:b/>
+          <w:bCs/>
+          <w:color w:val="D86DCB" w:themeColor="accent5" w:themeTint="99"/>
+          <w:sz w:val="32"/>
+          <w:szCs w:val="32"/>
+        </w:rPr>
+        <w:t>(</w:t>
+      </w:r>
+      <w:proofErr w:type="gramEnd"/>
+      <w:r>
+        <w:rPr>
+          <w:b/>
+          <w:bCs/>
+          <w:color w:val="D86DCB" w:themeColor="accent5" w:themeTint="99"/>
+          <w:sz w:val="32"/>
+          <w:szCs w:val="32"/>
+        </w:rPr>
+        <w:t xml:space="preserve">int </w:t>
+      </w:r>
+      <w:proofErr w:type="spellStart"/>
+      <w:r>
+        <w:rPr>
+          <w:b/>
+          <w:bCs/>
+          <w:color w:val="D86DCB" w:themeColor="accent5" w:themeTint="99"/>
+          <w:sz w:val="32"/>
+          <w:szCs w:val="32"/>
+        </w:rPr>
+        <w:t>movieId</w:t>
+      </w:r>
+      <w:proofErr w:type="spellEnd"/>
+      <w:r>
+        <w:rPr>
+          <w:b/>
+          <w:bCs/>
+          <w:color w:val="D86DCB" w:themeColor="accent5" w:themeTint="99"/>
+          <w:sz w:val="32"/>
+          <w:szCs w:val="32"/>
+        </w:rPr>
+        <w:t>) {</w:t>
+      </w:r>
+    </w:p>
+    <w:p>
+      <w:pPr>
+        <w:jc w:val="both"/>
+        <w:rPr>
+          <w:b/>
+          <w:bCs/>
+          <w:color w:val="D86DCB" w:themeColor="accent5" w:themeTint="99"/>
+          <w:sz w:val="32"/>
+          <w:szCs w:val="32"/>
+        </w:rPr>
+      </w:pPr>
+      <w:r>
+        <w:rPr>
+          <w:b/>
+          <w:bCs/>
+          <w:color w:val="D86DCB" w:themeColor="accent5" w:themeTint="99"/>
+          <w:sz w:val="32"/>
+          <w:szCs w:val="32"/>
+        </w:rPr>
+        <w:t xml:space="preserve">  if </w:t>
+      </w:r>
+      <w:proofErr w:type="gramStart"/>
+      <w:r>
+        <w:rPr>
+          <w:b/>
+          <w:bCs/>
+          <w:color w:val="D86DCB" w:themeColor="accent5" w:themeTint="99"/>
+          <w:sz w:val="32"/>
+          <w:szCs w:val="32"/>
+        </w:rPr>
+        <w:t>(!_</w:t>
+      </w:r>
+      <w:proofErr w:type="spellStart"/>
+      <w:proofErr w:type="gramEnd"/>
+      <w:r>
+        <w:rPr>
+          <w:b/>
+          <w:bCs/>
+          <w:color w:val="D86DCB" w:themeColor="accent5" w:themeTint="99"/>
+          <w:sz w:val="32"/>
+          <w:szCs w:val="32"/>
+        </w:rPr>
+        <w:t>cache.containsKey</w:t>
+      </w:r>
+      <w:proofErr w:type="spellEnd"/>
+      <w:r>
+        <w:rPr>
+          <w:b/>
+          <w:bCs/>
+          <w:color w:val="D86DCB" w:themeColor="accent5" w:themeTint="99"/>
+          <w:sz w:val="32"/>
+          <w:szCs w:val="32"/>
+        </w:rPr>
+        <w:t>(</w:t>
+      </w:r>
+      <w:proofErr w:type="spellStart"/>
+      <w:r>
+        <w:rPr>
+          <w:b/>
+          <w:bCs/>
+          <w:color w:val="D86DCB" w:themeColor="accent5" w:themeTint="99"/>
+          <w:sz w:val="32"/>
+          <w:szCs w:val="32"/>
+        </w:rPr>
+        <w:t>movieId</w:t>
+      </w:r>
+      <w:proofErr w:type="spellEnd"/>
+      <w:r>
+        <w:rPr>
+          <w:b/>
+          <w:bCs/>
+          <w:color w:val="D86DCB" w:themeColor="accent5" w:themeTint="99"/>
+          <w:sz w:val="32"/>
+          <w:szCs w:val="32"/>
+        </w:rPr>
+        <w:t>)) {</w:t>
+      </w:r>
+    </w:p>
+    <w:p>
+      <w:pPr>
+        <w:jc w:val="both"/>
+        <w:rPr>
+          <w:b/>
+          <w:bCs/>
+          <w:color w:val="D86DCB" w:themeColor="accent5" w:themeTint="99"/>
+          <w:sz w:val="32"/>
+          <w:szCs w:val="32"/>
+        </w:rPr>
+      </w:pPr>
+      <w:r>
+        <w:rPr>
+          <w:b/>
+          <w:bCs/>
+          <w:color w:val="D86DCB" w:themeColor="accent5" w:themeTint="99"/>
+          <w:sz w:val="32"/>
+          <w:szCs w:val="32"/>
+        </w:rPr>
+        <w:t xml:space="preserve">    return null;</w:t>
+      </w:r>
+    </w:p>
+    <w:p>
+      <w:pPr>
+        <w:jc w:val="both"/>
+        <w:rPr>
+          <w:b/>
+          <w:bCs/>
+          <w:color w:val="D86DCB" w:themeColor="accent5" w:themeTint="99"/>
+          <w:sz w:val="32"/>
+          <w:szCs w:val="32"/>
+        </w:rPr>
+      </w:pPr>
+      <w:r>
+        <w:rPr>
+          <w:b/>
+          <w:bCs/>
+          <w:color w:val="D86DCB" w:themeColor="accent5" w:themeTint="99"/>
+          <w:sz w:val="32"/>
+          <w:szCs w:val="32"/>
+        </w:rPr>
+        <w:t xml:space="preserve">  }</w:t>
+      </w:r>
+    </w:p>
+    <w:p>
+      <w:pPr>
+        <w:jc w:val="both"/>
+        <w:rPr>
+          <w:b/>
+          <w:bCs/>
+          <w:color w:val="D86DCB" w:themeColor="accent5" w:themeTint="99"/>
+          <w:sz w:val="32"/>
+          <w:szCs w:val="32"/>
+        </w:rPr>
+      </w:pPr>
+      <w:r>
+        <w:rPr>
+          <w:b/>
+          <w:bCs/>
+          <w:color w:val="D86DCB" w:themeColor="accent5" w:themeTint="99"/>
+          <w:sz w:val="32"/>
+          <w:szCs w:val="32"/>
+        </w:rPr>
+        <w:t xml:space="preserve">  final movie = _</w:t>
+      </w:r>
+      <w:proofErr w:type="spellStart"/>
+      <w:proofErr w:type="gramStart"/>
+      <w:r>
+        <w:rPr>
+          <w:b/>
+          <w:bCs/>
+          <w:color w:val="D86DCB" w:themeColor="accent5" w:themeTint="99"/>
+          <w:sz w:val="32"/>
+          <w:szCs w:val="32"/>
+        </w:rPr>
+        <w:t>cache.remove</w:t>
+      </w:r>
+      <w:proofErr w:type="spellEnd"/>
+      <w:proofErr w:type="gramEnd"/>
+      <w:r>
+        <w:rPr>
+          <w:b/>
+          <w:bCs/>
+          <w:color w:val="D86DCB" w:themeColor="accent5" w:themeTint="99"/>
+          <w:sz w:val="32"/>
+          <w:szCs w:val="32"/>
+        </w:rPr>
+        <w:t>(</w:t>
+      </w:r>
+      <w:proofErr w:type="spellStart"/>
+      <w:r>
+        <w:rPr>
+          <w:b/>
+          <w:bCs/>
+          <w:color w:val="D86DCB" w:themeColor="accent5" w:themeTint="99"/>
+          <w:sz w:val="32"/>
+          <w:szCs w:val="32"/>
+        </w:rPr>
+        <w:t>movieId</w:t>
+      </w:r>
+      <w:proofErr w:type="spellEnd"/>
+      <w:r>
+        <w:rPr>
+          <w:b/>
+          <w:bCs/>
+          <w:color w:val="D86DCB" w:themeColor="accent5" w:themeTint="99"/>
+          <w:sz w:val="32"/>
+          <w:szCs w:val="32"/>
+        </w:rPr>
+        <w:t>)!;</w:t>
+      </w:r>
+    </w:p>
+    <w:p>
+      <w:pPr>
+        <w:jc w:val="both"/>
+        <w:rPr>
+          <w:b/>
+          <w:bCs/>
+          <w:color w:val="D86DCB" w:themeColor="accent5" w:themeTint="99"/>
+          <w:sz w:val="32"/>
+          <w:szCs w:val="32"/>
+        </w:rPr>
+      </w:pPr>
+      <w:r>
+        <w:rPr>
+          <w:b/>
+          <w:bCs/>
+          <w:color w:val="D86DCB" w:themeColor="accent5" w:themeTint="99"/>
+          <w:sz w:val="32"/>
+          <w:szCs w:val="32"/>
+        </w:rPr>
+        <w:t xml:space="preserve">  _cache[</w:t>
+      </w:r>
+      <w:proofErr w:type="spellStart"/>
+      <w:r>
+        <w:rPr>
+          <w:b/>
+          <w:bCs/>
+          <w:color w:val="D86DCB" w:themeColor="accent5" w:themeTint="99"/>
+          <w:sz w:val="32"/>
+          <w:szCs w:val="32"/>
+        </w:rPr>
+        <w:t>movieId</w:t>
+      </w:r>
+      <w:proofErr w:type="spellEnd"/>
+      <w:r>
+        <w:rPr>
+          <w:b/>
+          <w:bCs/>
+          <w:color w:val="D86DCB" w:themeColor="accent5" w:themeTint="99"/>
+          <w:sz w:val="32"/>
+          <w:szCs w:val="32"/>
+        </w:rPr>
+        <w:t>] = movie;</w:t>
+      </w:r>
+    </w:p>
+    <w:p>
+      <w:pPr>
+        <w:jc w:val="both"/>
+        <w:rPr>
+          <w:b/>
+          <w:bCs/>
+          <w:color w:val="D86DCB" w:themeColor="accent5" w:themeTint="99"/>
+          <w:sz w:val="32"/>
+          <w:szCs w:val="32"/>
+        </w:rPr>
+      </w:pPr>
+      <w:r>
+        <w:rPr>
+          <w:b/>
+          <w:bCs/>
+          <w:color w:val="D86DCB" w:themeColor="accent5" w:themeTint="99"/>
+          <w:sz w:val="32"/>
+          <w:szCs w:val="32"/>
+        </w:rPr>
+        <w:lastRenderedPageBreak/>
+        <w:t xml:space="preserve">  return movie;</w:t>
+      </w:r>
+    </w:p>
+    <w:p>
+      <w:pPr>
+        <w:jc w:val="both"/>
+        <w:rPr>
+          <w:b/>
+          <w:bCs/>
+          <w:color w:val="D86DCB" w:themeColor="accent5" w:themeTint="99"/>
+          <w:sz w:val="32"/>
+          <w:szCs w:val="32"/>
+        </w:rPr>
+      </w:pPr>
+      <w:r>
+        <w:rPr>
+          <w:b/>
+          <w:bCs/>
+          <w:color w:val="D86DCB" w:themeColor="accent5" w:themeTint="99"/>
+          <w:sz w:val="32"/>
+          <w:szCs w:val="32"/>
+        </w:rPr>
+        <w:t>}</w:t>
+      </w:r>
+    </w:p>
+    <w:p>
+      <w:pPr>
+        <w:jc w:val="both"/>
+        <w:rPr>
+          <w:sz w:val="32"/>
+          <w:szCs w:val="32"/>
+        </w:rPr>
+      </w:pPr>
+      <w:r>
+        <w:rPr>
+          <w:sz w:val="32"/>
+          <w:szCs w:val="32"/>
+        </w:rPr>
+        <w:t># Add or save values with unique ID (for retrieving later):</w:t>
+      </w:r>
+    </w:p>
+    <w:p>
+      <w:pPr>
+        <w:jc w:val="both"/>
+        <w:rPr>
+          <w:b/>
+          <w:bCs/>
+          <w:color w:val="D86DCB" w:themeColor="accent5" w:themeTint="99"/>
+          <w:sz w:val="32"/>
+          <w:szCs w:val="32"/>
+        </w:rPr>
+      </w:pPr>
+      <w:r>
+        <w:rPr>
+          <w:b/>
+          <w:bCs/>
+          <w:color w:val="D86DCB" w:themeColor="accent5" w:themeTint="99"/>
+          <w:sz w:val="32"/>
+          <w:szCs w:val="32"/>
+        </w:rPr>
+        <w:t xml:space="preserve">void </w:t>
+      </w:r>
+      <w:proofErr w:type="spellStart"/>
+      <w:proofErr w:type="gramStart"/>
+      <w:r>
+        <w:rPr>
+          <w:b/>
+          <w:bCs/>
+          <w:color w:val="D86DCB" w:themeColor="accent5" w:themeTint="99"/>
+          <w:sz w:val="32"/>
+          <w:szCs w:val="32"/>
+        </w:rPr>
+        <w:t>saveMovie</w:t>
+      </w:r>
+      <w:proofErr w:type="spellEnd"/>
+      <w:r>
+        <w:rPr>
+          <w:b/>
+          <w:bCs/>
+          <w:color w:val="D86DCB" w:themeColor="accent5" w:themeTint="99"/>
+          <w:sz w:val="32"/>
+          <w:szCs w:val="32"/>
+        </w:rPr>
+        <w:t>(</w:t>
+      </w:r>
+      <w:proofErr w:type="gramEnd"/>
+    </w:p>
+    <w:p>
+      <w:pPr>
+        <w:jc w:val="both"/>
+        <w:rPr>
+          <w:b/>
+          <w:bCs/>
+          <w:color w:val="D86DCB" w:themeColor="accent5" w:themeTint="99"/>
+          <w:sz w:val="32"/>
+          <w:szCs w:val="32"/>
+        </w:rPr>
+      </w:pPr>
+      <w:r>
+        <w:rPr>
+          <w:b/>
+          <w:bCs/>
+          <w:color w:val="D86DCB" w:themeColor="accent5" w:themeTint="99"/>
+          <w:sz w:val="32"/>
+          <w:szCs w:val="32"/>
+        </w:rPr>
+        <w:t xml:space="preserve">  int </w:t>
+      </w:r>
+      <w:proofErr w:type="spellStart"/>
+      <w:r>
+        <w:rPr>
+          <w:b/>
+          <w:bCs/>
+          <w:color w:val="D86DCB" w:themeColor="accent5" w:themeTint="99"/>
+          <w:sz w:val="32"/>
+          <w:szCs w:val="32"/>
+        </w:rPr>
+        <w:t>movieId</w:t>
+      </w:r>
+      <w:proofErr w:type="spellEnd"/>
+      <w:r>
+        <w:rPr>
+          <w:b/>
+          <w:bCs/>
+          <w:color w:val="D86DCB" w:themeColor="accent5" w:themeTint="99"/>
+          <w:sz w:val="32"/>
+          <w:szCs w:val="32"/>
+        </w:rPr>
+        <w:t>,</w:t>
+      </w:r>
+    </w:p>
+    <w:p>
+      <w:pPr>
+        <w:jc w:val="both"/>
+        <w:rPr>
+          <w:b/>
+          <w:bCs/>
+          <w:color w:val="D86DCB" w:themeColor="accent5" w:themeTint="99"/>
+          <w:sz w:val="32"/>
+          <w:szCs w:val="32"/>
+        </w:rPr>
+      </w:pPr>
+      <w:r>
+        <w:rPr>
+          <w:b/>
+          <w:bCs/>
+          <w:color w:val="D86DCB" w:themeColor="accent5" w:themeTint="99"/>
+          <w:sz w:val="32"/>
+          <w:szCs w:val="32"/>
+        </w:rPr>
+        <w:t xml:space="preserve">  </w:t>
+      </w:r>
+      <w:proofErr w:type="spellStart"/>
+      <w:r>
+        <w:rPr>
+          <w:b/>
+          <w:bCs/>
+          <w:color w:val="D86DCB" w:themeColor="accent5" w:themeTint="99"/>
+          <w:sz w:val="32"/>
+          <w:szCs w:val="32"/>
+        </w:rPr>
+        <w:t>MovieDetailsModel</w:t>
+      </w:r>
+      <w:proofErr w:type="spellEnd"/>
+      <w:r>
+        <w:rPr>
+          <w:b/>
+          <w:bCs/>
+          <w:color w:val="D86DCB" w:themeColor="accent5" w:themeTint="99"/>
+          <w:sz w:val="32"/>
+          <w:szCs w:val="32"/>
+        </w:rPr>
+        <w:t xml:space="preserve"> movie,</w:t>
+      </w:r>
+    </w:p>
+    <w:p>
+      <w:pPr>
+        <w:jc w:val="both"/>
+        <w:rPr>
+          <w:b/>
+          <w:bCs/>
+          <w:color w:val="D86DCB" w:themeColor="accent5" w:themeTint="99"/>
+          <w:sz w:val="32"/>
+          <w:szCs w:val="32"/>
+        </w:rPr>
+      </w:pPr>
+      <w:r>
+        <w:rPr>
+          <w:b/>
+          <w:bCs/>
+          <w:color w:val="D86DCB" w:themeColor="accent5" w:themeTint="99"/>
+          <w:sz w:val="32"/>
+          <w:szCs w:val="32"/>
+        </w:rPr>
+        <w:t>) {</w:t>
+      </w:r>
+    </w:p>
+    <w:p>
+      <w:pPr>
+        <w:jc w:val="both"/>
+        <w:rPr>
+          <w:b/>
+          <w:bCs/>
+          <w:color w:val="D86DCB" w:themeColor="accent5" w:themeTint="99"/>
+          <w:sz w:val="32"/>
+          <w:szCs w:val="32"/>
+        </w:rPr>
+      </w:pPr>
+      <w:r>
+        <w:rPr>
+          <w:b/>
+          <w:bCs/>
+          <w:color w:val="D86DCB" w:themeColor="accent5" w:themeTint="99"/>
+          <w:sz w:val="32"/>
+          <w:szCs w:val="32"/>
+        </w:rPr>
+        <w:t xml:space="preserve">  _</w:t>
+      </w:r>
+      <w:proofErr w:type="spellStart"/>
+      <w:proofErr w:type="gramStart"/>
+      <w:r>
+        <w:rPr>
+          <w:b/>
+          <w:bCs/>
+          <w:color w:val="D86DCB" w:themeColor="accent5" w:themeTint="99"/>
+          <w:sz w:val="32"/>
+          <w:szCs w:val="32"/>
+        </w:rPr>
+        <w:t>cache.remove</w:t>
+      </w:r>
+      <w:proofErr w:type="spellEnd"/>
+      <w:proofErr w:type="gramEnd"/>
+      <w:r>
+        <w:rPr>
+          <w:b/>
+          <w:bCs/>
+          <w:color w:val="D86DCB" w:themeColor="accent5" w:themeTint="99"/>
+          <w:sz w:val="32"/>
+          <w:szCs w:val="32"/>
+        </w:rPr>
+        <w:t>(</w:t>
+      </w:r>
+      <w:proofErr w:type="spellStart"/>
+      <w:r>
+        <w:rPr>
+          <w:b/>
+          <w:bCs/>
+          <w:color w:val="D86DCB" w:themeColor="accent5" w:themeTint="99"/>
+          <w:sz w:val="32"/>
+          <w:szCs w:val="32"/>
+        </w:rPr>
+        <w:t>movieId</w:t>
+      </w:r>
+      <w:proofErr w:type="spellEnd"/>
+      <w:r>
+        <w:rPr>
+          <w:b/>
+          <w:bCs/>
+          <w:color w:val="D86DCB" w:themeColor="accent5" w:themeTint="99"/>
+          <w:sz w:val="32"/>
+          <w:szCs w:val="32"/>
+        </w:rPr>
+        <w:t>);</w:t>
+      </w:r>
+      <w:r>
+        <w:rPr>
+          <w:b/>
+          <w:bCs/>
+          <w:color w:val="D86DCB" w:themeColor="accent5" w:themeTint="99"/>
+          <w:sz w:val="32"/>
+          <w:szCs w:val="32"/>
+        </w:rPr>
+        <w:t xml:space="preserve">  // not important, just checking</w:t>
+      </w:r>
+    </w:p>
+    <w:p>
+      <w:pPr>
+        <w:jc w:val="both"/>
+        <w:rPr>
+          <w:b/>
+          <w:bCs/>
+          <w:color w:val="D86DCB" w:themeColor="accent5" w:themeTint="99"/>
+          <w:sz w:val="32"/>
+          <w:szCs w:val="32"/>
+        </w:rPr>
+      </w:pPr>
+      <w:r>
+        <w:rPr>
+          <w:b/>
+          <w:bCs/>
+          <w:color w:val="D86DCB" w:themeColor="accent5" w:themeTint="99"/>
+          <w:sz w:val="32"/>
+          <w:szCs w:val="32"/>
+        </w:rPr>
+        <w:t xml:space="preserve">  if (_</w:t>
+      </w:r>
+      <w:proofErr w:type="spellStart"/>
+      <w:proofErr w:type="gramStart"/>
+      <w:r>
+        <w:rPr>
+          <w:b/>
+          <w:bCs/>
+          <w:color w:val="D86DCB" w:themeColor="accent5" w:themeTint="99"/>
+          <w:sz w:val="32"/>
+          <w:szCs w:val="32"/>
+        </w:rPr>
+        <w:t>cache.length</w:t>
+      </w:r>
+      <w:proofErr w:type="spellEnd"/>
+      <w:proofErr w:type="gramEnd"/>
+      <w:r>
+        <w:rPr>
+          <w:b/>
+          <w:bCs/>
+          <w:color w:val="D86DCB" w:themeColor="accent5" w:themeTint="99"/>
+          <w:sz w:val="32"/>
+          <w:szCs w:val="32"/>
+        </w:rPr>
+        <w:t xml:space="preserve"> &gt;= 3) {</w:t>
+      </w:r>
+    </w:p>
+    <w:p>
+      <w:pPr>
+        <w:jc w:val="both"/>
+        <w:rPr>
+          <w:b/>
+          <w:bCs/>
+          <w:color w:val="D86DCB" w:themeColor="accent5" w:themeTint="99"/>
+          <w:sz w:val="32"/>
+          <w:szCs w:val="32"/>
+        </w:rPr>
+      </w:pPr>
+      <w:r>
+        <w:rPr>
+          <w:b/>
+          <w:bCs/>
+          <w:color w:val="D86DCB" w:themeColor="accent5" w:themeTint="99"/>
+          <w:sz w:val="32"/>
+          <w:szCs w:val="32"/>
+        </w:rPr>
+        <w:t xml:space="preserve">    _</w:t>
+      </w:r>
+      <w:proofErr w:type="spellStart"/>
+      <w:proofErr w:type="gramStart"/>
+      <w:r>
+        <w:rPr>
+          <w:b/>
+          <w:bCs/>
+          <w:color w:val="D86DCB" w:themeColor="accent5" w:themeTint="99"/>
+          <w:sz w:val="32"/>
+          <w:szCs w:val="32"/>
+        </w:rPr>
+        <w:t>cache.remove</w:t>
+      </w:r>
+      <w:proofErr w:type="spellEnd"/>
+      <w:proofErr w:type="gramEnd"/>
+      <w:r>
+        <w:rPr>
+          <w:b/>
+          <w:bCs/>
+          <w:color w:val="D86DCB" w:themeColor="accent5" w:themeTint="99"/>
+          <w:sz w:val="32"/>
+          <w:szCs w:val="32"/>
+        </w:rPr>
+        <w:t>(_</w:t>
+      </w:r>
+      <w:proofErr w:type="spellStart"/>
+      <w:r>
+        <w:rPr>
+          <w:b/>
+          <w:bCs/>
+          <w:color w:val="D86DCB" w:themeColor="accent5" w:themeTint="99"/>
+          <w:sz w:val="32"/>
+          <w:szCs w:val="32"/>
+        </w:rPr>
+        <w:t>cache.keys.first</w:t>
+      </w:r>
+      <w:proofErr w:type="spellEnd"/>
+      <w:r>
+        <w:rPr>
+          <w:b/>
+          <w:bCs/>
+          <w:color w:val="D86DCB" w:themeColor="accent5" w:themeTint="99"/>
+          <w:sz w:val="32"/>
+          <w:szCs w:val="32"/>
+        </w:rPr>
+        <w:t>);</w:t>
+      </w:r>
+    </w:p>
+    <w:p>
+      <w:pPr>
+        <w:jc w:val="both"/>
+        <w:rPr>
+          <w:b/>
+          <w:bCs/>
+          <w:color w:val="D86DCB" w:themeColor="accent5" w:themeTint="99"/>
+          <w:sz w:val="32"/>
+          <w:szCs w:val="32"/>
+        </w:rPr>
+      </w:pPr>
+      <w:r>
+        <w:rPr>
+          <w:b/>
+          <w:bCs/>
+          <w:color w:val="D86DCB" w:themeColor="accent5" w:themeTint="99"/>
+          <w:sz w:val="32"/>
+          <w:szCs w:val="32"/>
+        </w:rPr>
+        <w:t xml:space="preserve">  }</w:t>
+      </w:r>
+    </w:p>
+    <w:p>
+      <w:pPr>
+        <w:jc w:val="both"/>
+        <w:rPr>
+          <w:b/>
+          <w:bCs/>
+          <w:color w:val="D86DCB" w:themeColor="accent5" w:themeTint="99"/>
+          <w:sz w:val="32"/>
+          <w:szCs w:val="32"/>
+        </w:rPr>
+      </w:pPr>
+      <w:r>
+        <w:rPr>
+          <w:b/>
+          <w:bCs/>
+          <w:color w:val="D86DCB" w:themeColor="accent5" w:themeTint="99"/>
+          <w:sz w:val="32"/>
+          <w:szCs w:val="32"/>
+        </w:rPr>
+        <w:t xml:space="preserve">  _cache[</w:t>
+      </w:r>
+      <w:proofErr w:type="spellStart"/>
+      <w:r>
+        <w:rPr>
+          <w:b/>
+          <w:bCs/>
+          <w:color w:val="D86DCB" w:themeColor="accent5" w:themeTint="99"/>
+          <w:sz w:val="32"/>
+          <w:szCs w:val="32"/>
+        </w:rPr>
+        <w:t>movieId</w:t>
+      </w:r>
+      <w:proofErr w:type="spellEnd"/>
+      <w:r>
+        <w:rPr>
+          <w:b/>
+          <w:bCs/>
+          <w:color w:val="D86DCB" w:themeColor="accent5" w:themeTint="99"/>
+          <w:sz w:val="32"/>
+          <w:szCs w:val="32"/>
+        </w:rPr>
+        <w:t>] = movie;</w:t>
+      </w:r>
+    </w:p>
+    <w:p>
+      <w:pPr>
+        <w:jc w:val="both"/>
+        <w:rPr>
+          <w:b/>
+          <w:bCs/>
+          <w:color w:val="D86DCB" w:themeColor="accent5" w:themeTint="99"/>
+          <w:sz w:val="32"/>
+          <w:szCs w:val="32"/>
+        </w:rPr>
+      </w:pPr>
+      <w:r>
+        <w:rPr>
+          <w:b/>
+          <w:bCs/>
+          <w:color w:val="D86DCB" w:themeColor="accent5" w:themeTint="99"/>
+          <w:sz w:val="32"/>
+          <w:szCs w:val="32"/>
+        </w:rPr>
+        <w:t>}</w:t>
+      </w:r>
+    </w:p>
+    <w:p>
+      <w:pPr>
+        <w:jc w:val="both"/>
+        <w:rPr>
+          <w:sz w:val="32"/>
+          <w:szCs w:val="32"/>
         </w:rPr>
       </w:pPr>
     </w:p>

</xml_diff>

<commit_message>
Added monorepo and updated docs June 24th 2k26
</commit_message>
<xml_diff>
--- a/d4_dart_extras_throw_exception_and_more.docx
+++ b/d4_dart_extras_throw_exception_and_more.docx
@@ -3612,7 +3612,97 @@
           <w:sz w:val="32"/>
           <w:szCs w:val="32"/>
         </w:rPr>
-        <w:t xml:space="preserve"> is used to ensure a specific digit like 2 of numbers even if it is missing a digit like it’s a single digit 5 then specified character/String like </w:t>
+        <w:t xml:space="preserve"> is used to ensure </w:t>
+      </w:r>
+      <w:r>
+        <w:rPr>
+          <w:sz w:val="32"/>
+          <w:szCs w:val="32"/>
+        </w:rPr>
+        <w:t>a</w:t>
+      </w:r>
+      <w:r>
+        <w:rPr>
+          <w:sz w:val="32"/>
+          <w:szCs w:val="32"/>
+        </w:rPr>
+        <w:t xml:space="preserve"> </w:t>
+      </w:r>
+      <w:r>
+        <w:rPr>
+          <w:sz w:val="32"/>
+          <w:szCs w:val="32"/>
+        </w:rPr>
+        <w:t>number is a specific</w:t>
+      </w:r>
+      <w:r>
+        <w:rPr>
+          <w:sz w:val="32"/>
+          <w:szCs w:val="32"/>
+        </w:rPr>
+        <w:t xml:space="preserve"> </w:t>
+      </w:r>
+      <w:r>
+        <w:rPr>
+          <w:b/>
+          <w:bCs/>
+          <w:sz w:val="32"/>
+          <w:szCs w:val="32"/>
+        </w:rPr>
+        <w:t>2</w:t>
+      </w:r>
+      <w:r>
+        <w:rPr>
+          <w:sz w:val="32"/>
+          <w:szCs w:val="32"/>
+        </w:rPr>
+        <w:t xml:space="preserve"> digit</w:t>
+      </w:r>
+      <w:r>
+        <w:rPr>
+          <w:sz w:val="32"/>
+          <w:szCs w:val="32"/>
+        </w:rPr>
+        <w:t xml:space="preserve"> even if it is missing a digit like it’s a single digit</w:t>
+      </w:r>
+      <w:r>
+        <w:rPr>
+          <w:sz w:val="32"/>
+          <w:szCs w:val="32"/>
+        </w:rPr>
+        <w:t xml:space="preserve"> number</w:t>
+      </w:r>
+      <w:r>
+        <w:rPr>
+          <w:b/>
+          <w:bCs/>
+          <w:sz w:val="32"/>
+          <w:szCs w:val="32"/>
+        </w:rPr>
+        <w:t xml:space="preserve"> 5</w:t>
+      </w:r>
+      <w:r>
+        <w:rPr>
+          <w:sz w:val="32"/>
+          <w:szCs w:val="32"/>
+        </w:rPr>
+        <w:t xml:space="preserve"> then specified character/</w:t>
+      </w:r>
+      <w:r>
+        <w:rPr>
+          <w:b/>
+          <w:bCs/>
+          <w:sz w:val="32"/>
+          <w:szCs w:val="32"/>
+        </w:rPr>
+        <w:t>String</w:t>
+      </w:r>
+      <w:r>
+        <w:rPr>
+          <w:sz w:val="32"/>
+          <w:szCs w:val="32"/>
+        </w:rPr>
+        <w:t xml:space="preserve"> like </w:t>
       </w:r>
       <w:r>
         <w:rPr>
@@ -3628,7 +3718,23 @@
           <w:sz w:val="32"/>
           <w:szCs w:val="32"/>
         </w:rPr>
-        <w:t xml:space="preserve"> will be added automatically to the left to make it two digit. This is standard media formatting (music players, video players). Example: </w:t>
+        <w:t xml:space="preserve"> will be added automatically to the left to make it </w:t>
+      </w:r>
+      <w:r>
+        <w:rPr>
+          <w:b/>
+          <w:bCs/>
+          <w:sz w:val="32"/>
+          <w:szCs w:val="32"/>
+        </w:rPr>
+        <w:t>2</w:t>
+      </w:r>
+      <w:r>
+        <w:rPr>
+          <w:sz w:val="32"/>
+          <w:szCs w:val="32"/>
+        </w:rPr>
+        <w:t xml:space="preserve"> digit. This is standard media formatting (music players, video players). Example: </w:t>
       </w:r>
     </w:p>
     <w:p>
@@ -3864,7 +3970,17 @@
           <w:sz w:val="32"/>
           <w:szCs w:val="32"/>
         </w:rPr>
-        <w:t>padLeft</w:t>
+        <w:t>pa</w:t>
+      </w:r>
+      <w:r>
+        <w:rPr>
+          <w:b/>
+          <w:bCs/>
+          <w:color w:val="D86DCB" w:themeColor="accent5" w:themeTint="99"/>
+          <w:sz w:val="32"/>
+          <w:szCs w:val="32"/>
+        </w:rPr>
+        <w:t>dRight</w:t>
       </w:r>
       <w:proofErr w:type="spellEnd"/>
       <w:r>
@@ -3926,7 +4042,14 @@
           <w:sz w:val="32"/>
           <w:szCs w:val="32"/>
         </w:rPr>
-        <w:t xml:space="preserve">also </w:t>
+        <w:t>also</w:t>
+      </w:r>
+      <w:r>
+        <w:rPr>
+          <w:sz w:val="32"/>
+          <w:szCs w:val="32"/>
+        </w:rPr>
+        <w:t xml:space="preserve"> </w:t>
       </w:r>
       <w:r>
         <w:rPr>
@@ -39052,70 +39175,7 @@
           <w:sz w:val="32"/>
           <w:szCs w:val="32"/>
         </w:rPr>
-        <w:t xml:space="preserve">, It’s a “Zero Runtime Cost” </w:t>
-      </w:r>
-      <w:r>
-        <w:rPr>
-          <w:sz w:val="32"/>
-          <w:szCs w:val="32"/>
-        </w:rPr>
-        <w:t>Because compiler can optimize away abstraction.</w:t>
-      </w:r>
-      <w:r>
-        <w:rPr>
-          <w:sz w:val="32"/>
-          <w:szCs w:val="32"/>
-        </w:rPr>
-        <w:t xml:space="preserve"> </w:t>
-      </w:r>
-      <w:r>
-        <w:rPr>
-          <w:sz w:val="32"/>
-          <w:szCs w:val="32"/>
-        </w:rPr>
-        <w:t>This concept is called</w:t>
-      </w:r>
-      <w:r>
-        <w:rPr>
-          <w:sz w:val="32"/>
-          <w:szCs w:val="32"/>
-        </w:rPr>
-        <w:t xml:space="preserve"> “</w:t>
-      </w:r>
-      <w:r>
-        <w:rPr>
-          <w:sz w:val="32"/>
-          <w:szCs w:val="32"/>
-        </w:rPr>
-        <w:t>Zero-cost abstraction</w:t>
-      </w:r>
-      <w:r>
-        <w:rPr>
-          <w:sz w:val="32"/>
-          <w:szCs w:val="32"/>
-        </w:rPr>
-        <w:t>” which is v</w:t>
-      </w:r>
-      <w:r>
-        <w:rPr>
-          <w:sz w:val="32"/>
-          <w:szCs w:val="32"/>
-        </w:rPr>
-        <w:t>ery famous systems-programming idea</w:t>
-      </w:r>
-      <w:r>
-        <w:rPr>
-          <w:sz w:val="32"/>
-          <w:szCs w:val="32"/>
-        </w:rPr>
-        <w:t xml:space="preserve"> in l</w:t>
-      </w:r>
-      <w:r>
-        <w:rPr>
-          <w:sz w:val="32"/>
-          <w:szCs w:val="32"/>
-        </w:rPr>
-        <w:t>anguages like:</w:t>
+        <w:t>, It’s a “Zero Runtime Cost” Because compiler can optimize away abstraction. This concept is called “Zero-cost abstraction” which is very famous systems-programming idea in languages like:</w:t>
       </w:r>
     </w:p>
     <w:p>
@@ -39194,28 +39254,7 @@
           <w:sz w:val="32"/>
           <w:szCs w:val="32"/>
         </w:rPr>
-        <w:t># V</w:t>
-      </w:r>
-      <w:r>
-        <w:rPr>
-          <w:sz w:val="32"/>
-          <w:szCs w:val="32"/>
-        </w:rPr>
-        <w:t>alue this heavily.</w:t>
-      </w:r>
-      <w:r>
-        <w:rPr>
-          <w:sz w:val="32"/>
-          <w:szCs w:val="32"/>
-        </w:rPr>
-        <w:t xml:space="preserve"> N</w:t>
-      </w:r>
-      <w:r>
-        <w:rPr>
-          <w:sz w:val="32"/>
-          <w:szCs w:val="32"/>
-        </w:rPr>
-        <w:t xml:space="preserve">ow </w:t>
+        <w:t xml:space="preserve"># Value this heavily. Now </w:t>
       </w:r>
       <w:r>
         <w:rPr>
@@ -39336,49 +39375,7 @@
           <w:sz w:val="32"/>
           <w:szCs w:val="32"/>
         </w:rPr>
-        <w:t xml:space="preserve"># </w:t>
-      </w:r>
-      <w:r>
-        <w:rPr>
-          <w:sz w:val="32"/>
-          <w:szCs w:val="32"/>
-        </w:rPr>
-        <w:t xml:space="preserve">This is where </w:t>
-      </w:r>
-      <w:r>
-        <w:rPr>
-          <w:sz w:val="32"/>
-          <w:szCs w:val="32"/>
-        </w:rPr>
-        <w:t>e</w:t>
-      </w:r>
-      <w:r>
-        <w:rPr>
-          <w:sz w:val="32"/>
-          <w:szCs w:val="32"/>
-        </w:rPr>
-        <w:t xml:space="preserve">xtension </w:t>
-      </w:r>
-      <w:r>
-        <w:rPr>
-          <w:sz w:val="32"/>
-          <w:szCs w:val="32"/>
-        </w:rPr>
-        <w:t>t</w:t>
-      </w:r>
-      <w:r>
-        <w:rPr>
-          <w:sz w:val="32"/>
-          <w:szCs w:val="32"/>
-        </w:rPr>
-        <w:t>ype shine</w:t>
-      </w:r>
-      <w:r>
-        <w:rPr>
-          <w:sz w:val="32"/>
-          <w:szCs w:val="32"/>
-        </w:rPr>
-        <w:t>:</w:t>
+        <w:t># This is where extension type shine:</w:t>
       </w:r>
     </w:p>
     <w:p>
@@ -39619,44 +39616,23 @@
           <w:sz w:val="32"/>
           <w:szCs w:val="32"/>
         </w:rPr>
-        <w:t>It’s n</w:t>
-      </w:r>
-      <w:r>
-        <w:rPr>
-          <w:sz w:val="32"/>
-          <w:szCs w:val="32"/>
-        </w:rPr>
-        <w:t>ot full classes</w:t>
-      </w:r>
-      <w:r>
-        <w:rPr>
-          <w:sz w:val="32"/>
-          <w:szCs w:val="32"/>
-        </w:rPr>
-        <w:t>:</w:t>
-      </w:r>
-    </w:p>
-    <w:p>
-      <w:pPr>
-        <w:jc w:val="both"/>
-        <w:rPr>
-          <w:sz w:val="32"/>
-          <w:szCs w:val="32"/>
-        </w:rPr>
-      </w:pPr>
-      <w:r>
-        <w:rPr>
-          <w:sz w:val="32"/>
-          <w:szCs w:val="32"/>
-        </w:rPr>
-        <w:t># We</w:t>
-      </w:r>
-      <w:r>
-        <w:rPr>
-          <w:sz w:val="32"/>
-          <w:szCs w:val="32"/>
-        </w:rPr>
-        <w:t xml:space="preserve"> can’t treat them exactly like normal classes.</w:t>
+        <w:t>It’s not full classes:</w:t>
+      </w:r>
+    </w:p>
+    <w:p>
+      <w:pPr>
+        <w:jc w:val="both"/>
+        <w:rPr>
+          <w:sz w:val="32"/>
+          <w:szCs w:val="32"/>
+        </w:rPr>
+      </w:pPr>
+      <w:r>
+        <w:rPr>
+          <w:sz w:val="32"/>
+          <w:szCs w:val="32"/>
+        </w:rPr>
+        <w:t># We can’t treat them exactly like normal classes.</w:t>
       </w:r>
     </w:p>
     <w:p>
@@ -39677,93 +39653,23 @@
           <w:sz w:val="32"/>
           <w:szCs w:val="32"/>
         </w:rPr>
-        <w:t>Interop complexity</w:t>
-      </w:r>
-      <w:r>
-        <w:rPr>
-          <w:sz w:val="32"/>
-          <w:szCs w:val="32"/>
-        </w:rPr>
-        <w:t>:</w:t>
-      </w:r>
-    </w:p>
-    <w:p>
-      <w:pPr>
-        <w:jc w:val="both"/>
-        <w:rPr>
-          <w:sz w:val="32"/>
-          <w:szCs w:val="32"/>
-        </w:rPr>
-      </w:pPr>
-      <w:r>
-        <w:rPr>
-          <w:sz w:val="32"/>
-          <w:szCs w:val="32"/>
-        </w:rPr>
-        <w:t xml:space="preserve"># </w:t>
-      </w:r>
-      <w:r>
-        <w:rPr>
-          <w:sz w:val="32"/>
-          <w:szCs w:val="32"/>
-        </w:rPr>
-        <w:t>Sometimes</w:t>
-      </w:r>
-      <w:r>
-        <w:rPr>
-          <w:sz w:val="32"/>
-          <w:szCs w:val="32"/>
-        </w:rPr>
-        <w:t xml:space="preserve"> </w:t>
-      </w:r>
-      <w:r>
-        <w:rPr>
-          <w:sz w:val="32"/>
-          <w:szCs w:val="32"/>
-        </w:rPr>
-        <w:t>JSON serialization</w:t>
-      </w:r>
-      <w:r>
-        <w:rPr>
-          <w:sz w:val="32"/>
-          <w:szCs w:val="32"/>
-        </w:rPr>
-        <w:t xml:space="preserve">, </w:t>
-      </w:r>
-      <w:r>
-        <w:rPr>
-          <w:sz w:val="32"/>
-          <w:szCs w:val="32"/>
-        </w:rPr>
-        <w:t>generics</w:t>
-      </w:r>
-      <w:r>
-        <w:rPr>
-          <w:sz w:val="32"/>
-          <w:szCs w:val="32"/>
-        </w:rPr>
-        <w:t xml:space="preserve"> &amp; </w:t>
-      </w:r>
-      <w:r>
-        <w:rPr>
-          <w:sz w:val="32"/>
-          <w:szCs w:val="32"/>
-        </w:rPr>
-        <w:t>reflection</w:t>
-      </w:r>
-      <w:r>
-        <w:rPr>
-          <w:sz w:val="32"/>
-          <w:szCs w:val="32"/>
-        </w:rPr>
-        <w:t xml:space="preserve"> </w:t>
-      </w:r>
-      <w:r>
-        <w:rPr>
-          <w:sz w:val="32"/>
-          <w:szCs w:val="32"/>
-        </w:rPr>
-        <w:t>can become trickier.</w:t>
+        <w:t>Interop complexity:</w:t>
+      </w:r>
+    </w:p>
+    <w:p>
+      <w:pPr>
+        <w:jc w:val="both"/>
+        <w:rPr>
+          <w:sz w:val="32"/>
+          <w:szCs w:val="32"/>
+        </w:rPr>
+      </w:pPr>
+      <w:r>
+        <w:rPr>
+          <w:sz w:val="32"/>
+          <w:szCs w:val="32"/>
+        </w:rPr>
+        <w:t># Sometimes JSON serialization, generics &amp; reflection can become trickier.</w:t>
       </w:r>
     </w:p>
     <w:p>
@@ -39784,93 +39690,23 @@
           <w:sz w:val="32"/>
           <w:szCs w:val="32"/>
         </w:rPr>
-        <w:t xml:space="preserve">Ecosystem </w:t>
-      </w:r>
-      <w:r>
-        <w:rPr>
-          <w:sz w:val="32"/>
-          <w:szCs w:val="32"/>
-        </w:rPr>
-        <w:t xml:space="preserve">is </w:t>
-      </w:r>
-      <w:r>
-        <w:rPr>
-          <w:sz w:val="32"/>
-          <w:szCs w:val="32"/>
-        </w:rPr>
-        <w:t>still maturing</w:t>
-      </w:r>
-      <w:r>
-        <w:rPr>
-          <w:sz w:val="32"/>
-          <w:szCs w:val="32"/>
-        </w:rPr>
-        <w:t>:</w:t>
-      </w:r>
-    </w:p>
-    <w:p>
-      <w:pPr>
-        <w:jc w:val="both"/>
-        <w:rPr>
-          <w:sz w:val="32"/>
-          <w:szCs w:val="32"/>
-        </w:rPr>
-      </w:pPr>
-      <w:r>
-        <w:rPr>
-          <w:sz w:val="32"/>
-          <w:szCs w:val="32"/>
-        </w:rPr>
-        <w:t xml:space="preserve"># </w:t>
-      </w:r>
-      <w:r>
-        <w:rPr>
-          <w:sz w:val="32"/>
-          <w:szCs w:val="32"/>
-        </w:rPr>
-        <w:t>Many packages/tools</w:t>
-      </w:r>
-      <w:r>
-        <w:rPr>
-          <w:sz w:val="32"/>
-          <w:szCs w:val="32"/>
-        </w:rPr>
-        <w:t xml:space="preserve">, </w:t>
-      </w:r>
-      <w:r>
-        <w:rPr>
-          <w:sz w:val="32"/>
-          <w:szCs w:val="32"/>
-        </w:rPr>
-        <w:t>tutorials</w:t>
-      </w:r>
-      <w:r>
-        <w:rPr>
-          <w:sz w:val="32"/>
-          <w:szCs w:val="32"/>
-        </w:rPr>
-        <w:t xml:space="preserve"> &amp; </w:t>
-      </w:r>
-      <w:r>
-        <w:rPr>
-          <w:sz w:val="32"/>
-          <w:szCs w:val="32"/>
-        </w:rPr>
-        <w:t>generators</w:t>
-      </w:r>
-      <w:r>
-        <w:rPr>
-          <w:sz w:val="32"/>
-          <w:szCs w:val="32"/>
-        </w:rPr>
-        <w:t xml:space="preserve"> </w:t>
-      </w:r>
-      <w:r>
-        <w:rPr>
-          <w:sz w:val="32"/>
-          <w:szCs w:val="32"/>
-        </w:rPr>
-        <w:t>don’t deeply support them yet.</w:t>
+        <w:t>Ecosystem is still maturing:</w:t>
+      </w:r>
+    </w:p>
+    <w:p>
+      <w:pPr>
+        <w:jc w:val="both"/>
+        <w:rPr>
+          <w:sz w:val="32"/>
+          <w:szCs w:val="32"/>
+        </w:rPr>
+      </w:pPr>
+      <w:r>
+        <w:rPr>
+          <w:sz w:val="32"/>
+          <w:szCs w:val="32"/>
+        </w:rPr>
+        <w:t># Many packages/tools, tutorials &amp; generators don’t deeply support them yet.</w:t>
       </w:r>
     </w:p>
     <w:p>
@@ -39891,44 +39727,23 @@
           <w:sz w:val="32"/>
           <w:szCs w:val="32"/>
         </w:rPr>
-        <w:t>Can be overengineering</w:t>
-      </w:r>
-      <w:r>
-        <w:rPr>
-          <w:sz w:val="32"/>
-          <w:szCs w:val="32"/>
-        </w:rPr>
-        <w:t>:</w:t>
-      </w:r>
-    </w:p>
-    <w:p>
-      <w:pPr>
-        <w:jc w:val="both"/>
-        <w:rPr>
-          <w:sz w:val="32"/>
-          <w:szCs w:val="32"/>
-        </w:rPr>
-      </w:pPr>
-      <w:r>
-        <w:rPr>
-          <w:sz w:val="32"/>
-          <w:szCs w:val="32"/>
-        </w:rPr>
-        <w:t xml:space="preserve"># </w:t>
-      </w:r>
-      <w:r>
-        <w:rPr>
-          <w:sz w:val="32"/>
-          <w:szCs w:val="32"/>
-        </w:rPr>
-        <w:t>This</w:t>
-      </w:r>
-      <w:r>
-        <w:rPr>
-          <w:sz w:val="32"/>
-          <w:szCs w:val="32"/>
-        </w:rPr>
-        <w:t xml:space="preserve"> </w:t>
+        <w:t>Can be overengineering:</w:t>
+      </w:r>
+    </w:p>
+    <w:p>
+      <w:pPr>
+        <w:jc w:val="both"/>
+        <w:rPr>
+          <w:sz w:val="32"/>
+          <w:szCs w:val="32"/>
+        </w:rPr>
+      </w:pPr>
+      <w:r>
+        <w:rPr>
+          <w:sz w:val="32"/>
+          <w:szCs w:val="32"/>
+        </w:rPr>
+        <w:t xml:space="preserve"># This </w:t>
       </w:r>
       <w:r>
         <w:rPr>
@@ -39975,42 +39790,7 @@
           <w:sz w:val="32"/>
           <w:szCs w:val="32"/>
         </w:rPr>
-        <w:t xml:space="preserve"> </w:t>
-      </w:r>
-      <w:r>
-        <w:rPr>
-          <w:sz w:val="32"/>
-          <w:szCs w:val="32"/>
-        </w:rPr>
-        <w:t xml:space="preserve">for a tiny </w:t>
-      </w:r>
-      <w:r>
-        <w:rPr>
-          <w:sz w:val="32"/>
-          <w:szCs w:val="32"/>
-        </w:rPr>
-        <w:t>Todo</w:t>
-      </w:r>
-      <w:r>
-        <w:rPr>
-          <w:sz w:val="32"/>
-          <w:szCs w:val="32"/>
-        </w:rPr>
-        <w:t xml:space="preserve"> app</w:t>
-      </w:r>
-      <w:r>
-        <w:rPr>
-          <w:sz w:val="32"/>
-          <w:szCs w:val="32"/>
-        </w:rPr>
-        <w:t xml:space="preserve"> is p</w:t>
-      </w:r>
-      <w:r>
-        <w:rPr>
-          <w:sz w:val="32"/>
-          <w:szCs w:val="32"/>
-        </w:rPr>
-        <w:t>robably unnecessary.</w:t>
+        <w:t xml:space="preserve"> for a tiny Todo app is probably unnecessary.</w:t>
       </w:r>
     </w:p>
     <w:p>
@@ -47947,6 +47727,7 @@
   <w:style w:type="character" w:default="1" w:styleId="DefaultParagraphFont">
     <w:name w:val="Default Paragraph Font"/>
     <w:uiPriority w:val="1"/>
+    <w:semiHidden/>
     <w:unhideWhenUsed/>
   </w:style>
   <w:style w:type="table" w:default="1" w:styleId="TableNormal">

</xml_diff>